<commit_message>
docs: incorporacion de requerimientos de seguridad y fiabilidad, actualizacion de RTM y documento Word
</commit_message>
<xml_diff>
--- a/Documentacion_Relojeria_IA.docx
+++ b/Documentacion_Relojeria_IA.docx
@@ -635,6 +635,102 @@
       </w:r>
     </w:p>
     <w:p>
+      <w:pPr>
+        <w:pStyle w:val="Heading3"/>
+      </w:pPr>
+      <w:r>
+        <w:t>3.6. Requerimientos de Seguridad (SEC)</w:t>
+      </w:r>
+    </w:p>
+    <w:p>
+      <w:pPr>
+        <w:pStyle w:val="NoSpacing"/>
+      </w:pPr>
+      <w:r>
+        <w:t>| ID | Nombre | Descripción | Actores | Prioridad | Criterios de Aceptación |</w:t>
+      </w:r>
+    </w:p>
+    <w:p>
+      <w:pPr>
+        <w:pStyle w:val="NoSpacing"/>
+      </w:pPr>
+      <w:r>
+        <w:t>| :--- | :--- | :--- | :--- | :---: | :--- |</w:t>
+      </w:r>
+    </w:p>
+    <w:p>
+      <w:pPr>
+        <w:pStyle w:val="NoSpacing"/>
+      </w:pPr>
+      <w:r>
+        <w:t>| **REQ-SEC-001** | Row Level Security (RLS) | Políticas en la DB para restringir acceso a nivel de fila según el `user_id` o `role`. | Sistema | Crítica | Ninguna consulta externa puede leer datos sin un JWT válido y permisos de rol asociados. |</w:t>
+      </w:r>
+    </w:p>
+    <w:p>
+      <w:pPr>
+        <w:pStyle w:val="NoSpacing"/>
+      </w:pPr>
+      <w:r>
+        <w:t>| **REQ-SEC-002** | Cifrado en Tránsito (SSL) | Garantía de que toda la comunicación entre cliente y servidor es vía HTTPS. | Sistema | Alta | Redirección automática de HTTP a HTTPS en todos los endpoints de la App y API. |</w:t>
+      </w:r>
+    </w:p>
+    <w:p>
+      <w:pPr>
+        <w:pStyle w:val="NoSpacing"/>
+      </w:pPr>
+      <w:r>
+        <w:t>| **REQ-SEC-003** | Gestión de Sesión | Expiración de tokens de acceso y renovación segura (JWT Refresh). | Sistema | Media | El usuario es redirigido al login tras un periodo de inactividad prolongado (config Supabase). |</w:t>
+      </w:r>
+    </w:p>
+    <w:p>
+      <w:pPr>
+        <w:pStyle w:val="NoSpacing"/>
+      </w:pPr>
+      <w:r>
+        <w:t>| **REQ-SEC-004** | Protección CSRF/XSS | Prevención de ataques mediante el uso de frames seguros y saneamiento de inputs. | Sistema | Alta | Uso de `cookies httpOnly` y políticas de seguridad de contenido (CSP) por defecto de Next.js. |</w:t>
+      </w:r>
+    </w:p>
+    <w:p>
+      <w:pPr>
+        <w:pStyle w:val="Heading3"/>
+      </w:pPr>
+      <w:r>
+        <w:t>3.7. Requerimientos de Fiabilidad y Mantenimiento (REL)</w:t>
+      </w:r>
+    </w:p>
+    <w:p>
+      <w:pPr>
+        <w:pStyle w:val="NoSpacing"/>
+      </w:pPr>
+      <w:r>
+        <w:t>| ID | Nombre | Descripción | Actores | Prioridad | Criterios de Aceptación |</w:t>
+      </w:r>
+    </w:p>
+    <w:p>
+      <w:pPr>
+        <w:pStyle w:val="NoSpacing"/>
+      </w:pPr>
+      <w:r>
+        <w:t>| :--- | :--- | :--- | :--- | :---: | :--- |</w:t>
+      </w:r>
+    </w:p>
+    <w:p>
+      <w:pPr>
+        <w:pStyle w:val="NoSpacing"/>
+      </w:pPr>
+      <w:r>
+        <w:t>| **REQ-REL-001** | Backup Automático | Copias de seguridad diarias de la base de datos PostgreSQL. | Sistema | Alta | Capacidad de restauración a un punto en el tiempo (PITR) de hasta 7 días. |</w:t>
+      </w:r>
+    </w:p>
+    <w:p>
+      <w:pPr>
+        <w:pStyle w:val="NoSpacing"/>
+      </w:pPr>
+      <w:r>
+        <w:t>| **REQ-REL-002** | Alta Disponibilidad | Garantía de tiempo en línea superior al 99.9%. | Sistema | Media | El sistema debe estar accesible sin interrupciones críticas durante el horario comercial. |</w:t>
+      </w:r>
+    </w:p>
+    <w:p>
       <w:r>
         <w:t>---</w:t>
       </w:r>
@@ -1858,6 +1954,54 @@
       </w:pPr>
       <w:r>
         <w:t>| **REQ-DOM-002** | `inventario/page.tsx` (Form Inputs) | ✅ | Validación de números positivos y decimales. |</w:t>
+      </w:r>
+    </w:p>
+    <w:p>
+      <w:pPr>
+        <w:pStyle w:val="NoSpacing"/>
+      </w:pPr>
+      <w:r>
+        <w:t>| **REQ-SEC-001** | `ARCHITECTURE.md` (WIP) / Supabase | 🏗️ | *En revision de politicas RLS.* |</w:t>
+      </w:r>
+    </w:p>
+    <w:p>
+      <w:pPr>
+        <w:pStyle w:val="NoSpacing"/>
+      </w:pPr>
+      <w:r>
+        <w:t>| **REQ-SEC-002** | Infraestructura (Vercel/Supabase) | ✅ | Forzado de SSL en todos los dominios. |</w:t>
+      </w:r>
+    </w:p>
+    <w:p>
+      <w:pPr>
+        <w:pStyle w:val="NoSpacing"/>
+      </w:pPr>
+      <w:r>
+        <w:t>| **REQ-SEC-003** | `AuthProvider.tsx` (JWT Config) | ✅ | Expiración de sesión gestionada por Supabase. |</w:t>
+      </w:r>
+    </w:p>
+    <w:p>
+      <w:pPr>
+        <w:pStyle w:val="NoSpacing"/>
+      </w:pPr>
+      <w:r>
+        <w:t>| **REQ-SEC-004** | `lib/supabase.ts` / Next.js | ✅ | Prevención nativa de Inyecciones y XSS. |</w:t>
+      </w:r>
+    </w:p>
+    <w:p>
+      <w:pPr>
+        <w:pStyle w:val="NoSpacing"/>
+      </w:pPr>
+      <w:r>
+        <w:t>| **REQ-REL-001** | Infraestructura (Supabase) | ✅ | Backups diarios automáticos habilitados. |</w:t>
+      </w:r>
+    </w:p>
+    <w:p>
+      <w:pPr>
+        <w:pStyle w:val="NoSpacing"/>
+      </w:pPr>
+      <w:r>
+        <w:t>| **REQ-REL-002** | Infraestructura (Supabase) | ✅ | SLA de disponibilidad del 99.9%. |</w:t>
       </w:r>
     </w:p>
     <w:p>

</xml_diff>